<commit_message>
Recarga de evidencias APT122 - Seccion 006 - Grupo 2
</commit_message>
<xml_diff>
--- a/FASE 1/Evidencias Grupales/1.5_GuiaEstudiante_Fase 1_Definicion Proyecto APT (Espanol).docx
+++ b/FASE 1/Evidencias Grupales/1.5_GuiaEstudiante_Fase 1_Definicion Proyecto APT (Espanol).docx
@@ -1960,7 +1960,7 @@
                 <w:rFonts w:ascii="Arial" w:cs="Arial" w:eastAsia="Arial" w:hAnsi="Arial"/>
                 <w:rtl w:val="0"/>
               </w:rPr>
-              <w:t xml:space="preserve">El Liceo Santa Juliana padece de ineficiencia administrativa debido a la dependencia de planillas de cálculo (Excel) y formularios en papel para su gestión diaria. Esta problemática impacta negativamente a toda la comunidad educativa: docentes que pierden tiempo lectivo en registros manuales, administrativos sin visibilidad del stock de insumos, personal TI sin trazabilidad de fallas de hardware, y apoderados obligados a asistir presencialmente para solicitar certificados. Resolver esto es altamente relevante para el campo laboral de la informática, ya que representa un proceso clásico de transformación digital organizacional. El aporte de valor del proyecto es la entrega de una plataforma web que centraliza y automatiza estos macroprocesos, optimizando la continuidad operativa del establecimiento.</w:t>
+              <w:t xml:space="preserve">El colegio Santa Juliana padece de ineficiencia administrativa debido a la dependencia de planillas de cálculo (Excel) y formularios en papel para su gestión diaria. Esta problemática impacta negativamente a toda la comunidad educativa: docentes que pierden tiempo lectivo en registros manuales, administrativos sin visibilidad del stock de insumos, personal TI sin trazabilidad de fallas de hardware, y apoderados obligados a asistir presencialmente para solicitar certificados. Resolver esto es altamente relevante para el campo laboral de la informática, ya que representa un proceso clásico de transformación digital organizacional. El aporte de valor del proyecto es la entrega de una plataforma web que centraliza y automatiza estos macroprocesos, optimizando la continuidad operativa del establecimiento.</w:t>
             </w:r>
             <w:r>
               <w:rPr>
@@ -2201,7 +2201,7 @@
               <w:shd w:fill="auto" w:val="clear"/>
               <w:spacing w:after="160" w:before="0" w:line="259" w:lineRule="auto"/>
               <w:ind w:left="0" w:right="0" w:firstLine="0"/>
-              <w:jc w:val="left"/>
+              <w:jc w:val="both"/>
               <w:rPr>
                 <w:rFonts w:ascii="Arial" w:cs="Arial" w:eastAsia="Arial" w:hAnsi="Arial"/>
               </w:rPr>
@@ -2509,7 +2509,7 @@
                 <w:rFonts w:ascii="Arial" w:cs="Arial" w:eastAsia="Arial" w:hAnsi="Arial"/>
                 <w:rtl w:val="0"/>
               </w:rPr>
-              <w:t xml:space="preserve">Desarrollar e implementar una plataforma web centralizada para la gestión académica, logística y de soporte informático del Liceo Santa Juliana, mejorando la eficiencia operativa del establecimiento. </w:t>
+              <w:t xml:space="preserve">Desarrollar e implementar una plataforma web centralizada para la gestión académica, logística y de soporte informático del colegio Santa Juliana, mejorando la eficiencia operativa del establecimiento. </w:t>
             </w:r>
           </w:p>
         </w:tc>
@@ -2930,6 +2930,7 @@
               </w:numPr>
               <w:spacing w:after="0" w:afterAutospacing="0" w:line="276" w:lineRule="auto"/>
               <w:ind w:left="720" w:hanging="360"/>
+              <w:jc w:val="both"/>
               <w:rPr>
                 <w:i w:val="1"/>
                 <w:iCs w:val="1"/>
@@ -2955,6 +2956,7 @@
               </w:numPr>
               <w:spacing w:after="0" w:afterAutospacing="0" w:line="276" w:lineRule="auto"/>
               <w:ind w:left="720" w:hanging="360"/>
+              <w:jc w:val="both"/>
               <w:rPr>
                 <w:i w:val="1"/>
                 <w:iCs w:val="1"/>
@@ -2980,6 +2982,7 @@
               </w:numPr>
               <w:spacing w:after="240" w:line="276" w:lineRule="auto"/>
               <w:ind w:left="720" w:hanging="360"/>
+              <w:jc w:val="both"/>
               <w:rPr>
                 <w:i w:val="1"/>
                 <w:iCs w:val="1"/>
@@ -4908,7 +4911,7 @@
                 <w:szCs w:val="20"/>
                 <w:rtl w:val="0"/>
               </w:rPr>
-              <w:t xml:space="preserve">Facilitador: Apoyo directo de las autoridades del Liceo Santa Juliana para formalizar el proyecto.</w:t>
+              <w:t xml:space="preserve">Facilitador: Apoyo directo de las autoridades del colegio Santa Juliana para formalizar el proyecto.</w:t>
             </w:r>
           </w:p>
         </w:tc>
@@ -6238,7 +6241,7 @@
                 <w:szCs w:val="20"/>
                 <w:rtl w:val="0"/>
               </w:rPr>
-              <w:t xml:space="preserve">Facilitador: Existencia previa del manual de identidad visual institucional del liceo.</w:t>
+              <w:t xml:space="preserve">Facilitador: Existencia previa del manual de identidad visual institucional del colegio.</w:t>
             </w:r>
           </w:p>
         </w:tc>

</xml_diff>